<commit_message>
Completa il caso Rosa con revisione e verbale, corregge la scheda collage
</commit_message>
<xml_diff>
--- a/materiali/laboratorio/Infanzia/Scheda_BambinoLAB_05_CollageNatura.docx
+++ b/materiali/laboratorio/Infanzia/Scheda_BambinoLAB_05_CollageNatura.docx
@@ -3747,7 +3747,7 @@
                 <w:sz w:val="20"/>
                 <w:szCs w:val="20"/>
               </w:rPr>
-              <w:t xml:space="preserve">Il bambino era indeciso e insicuro.</w:t>
+              <w:t xml:space="preserve">Descrivi azioni e aiuti ricevuti, non etichette come «insicuro».</w:t>
             </w:r>
           </w:p>
           <w:p>
@@ -3947,43 +3947,11 @@
                 <w:bCs/>
                 <w:i w:val="false"/>
                 <w:iCs w:val="false"/>
-                <w:color w:val="C55A11"/>
-                <w:sz w:val="19"/>
-                <w:szCs w:val="19"/>
-              </w:rPr>
-              <w:t xml:space="preserve">Risposta sbagliata: </w:t>
-            </w:r>
-            <w:r>
-              <w:rPr>
-                <w:rFonts w:ascii="Arial" w:cs="Arial" w:eastAsia="Arial" w:hAnsi="Arial"/>
-                <w:b w:val="false"/>
-                <w:bCs w:val="false"/>
-                <w:i/>
-                <w:iCs/>
-                <w:color w:val="000000"/>
-                <w:sz w:val="19"/>
-                <w:szCs w:val="19"/>
-              </w:rPr>
-              <w:t xml:space="preserve">"Alle 10.55 Marco ha spostato una foglia di quercia tre volte in posizioni diverse sul cartoncino, la terza volta nell'angolo in basso a destra. Poi ha guardato il foglio per 20 secondi senza toccare nulla."</w:t>
-            </w:r>
-          </w:p>
-          <w:p>
-            <w:pPr>
-              <w:spacing w:before="10" w:after="40"/>
-              <w:jc w:val="left"/>
-            </w:pPr>
-            <w:r>
-              <w:rPr>
-                <w:rFonts w:ascii="Arial" w:cs="Arial" w:eastAsia="Arial" w:hAnsi="Arial"/>
-                <w:b/>
-                <w:bCs/>
-                <w:i w:val="false"/>
-                <w:iCs w:val="false"/>
                 <w:color w:val="375623"/>
                 <w:sz w:val="19"/>
                 <w:szCs w:val="19"/>
               </w:rPr>
-              <w:t xml:space="preserve">Risposta giusta: </w:t>
+              <w:t xml:space="preserve">Esempio descrittivo: "Alle 10.55 Marco ha spostato una foglia di quercia tre volte in posizioni diverse sul cartoncino, la terza volta nell'angolo in basso a destra. Poi ha guardato il foglio per 20 secondi senza toccare nulla."</w:t>
             </w:r>
             <w:r>
               <w:rPr>
@@ -3992,11 +3960,43 @@
                 <w:bCs w:val="false"/>
                 <w:i/>
                 <w:iCs/>
-                <w:color w:val="000000"/>
+                <w:color w:val="375623"/>
                 <w:sz w:val="19"/>
                 <w:szCs w:val="19"/>
               </w:rPr>
-              <w:t xml:space="preserve">"/home/claude/Scheda_BambinoLAB_05_CollageNatura.docx"</w:t>
+              <w:t xml:space="preserve"/>
+            </w:r>
+          </w:p>
+          <w:p>
+            <w:pPr>
+              <w:spacing w:before="10" w:after="40"/>
+              <w:jc w:val="left"/>
+            </w:pPr>
+            <w:r>
+              <w:rPr>
+                <w:rFonts w:ascii="Arial" w:cs="Arial" w:eastAsia="Arial" w:hAnsi="Arial"/>
+                <w:b/>
+                <w:bCs/>
+                <w:i w:val="false"/>
+                <w:iCs w:val="false"/>
+                <w:color w:val="A75134"/>
+                <w:sz w:val="19"/>
+                <w:szCs w:val="19"/>
+              </w:rPr>
+              <w:t xml:space="preserve">Da evitare: «Marco è indeciso e insicuro». Interpreta, senza descrivere azioni.</w:t>
+            </w:r>
+            <w:r>
+              <w:rPr>
+                <w:rFonts w:ascii="Arial" w:cs="Arial" w:eastAsia="Arial" w:hAnsi="Arial"/>
+                <w:b w:val="false"/>
+                <w:bCs w:val="false"/>
+                <w:i/>
+                <w:iCs/>
+                <w:color w:val="A75134"/>
+                <w:sz w:val="19"/>
+                <w:szCs w:val="19"/>
+              </w:rPr>
+              <w:t xml:space="preserve"/>
             </w:r>
           </w:p>
           <w:p>

</xml_diff>